<commit_message>
Paper A: title finalized (user-selected physics-first variant)
"Spacetime quantities from causal order: an operational ladder with
preregistered validations at finite density" replaces the working title
everywhere it is printed: manuscript.md heading, paper README, article
front matter (papertitle + running-head shorttitle "Spacetime
quantities from causal order"), the SI document's title and running
head, the Word-set generator's TITLE constant, and the cover letter's
quoted title. Article and SI rebuilt (26 pp + 4 pp, 0 overfull,
0 undefined), Word set regenerated, 116 contract tests and
check_numbers (516/496) green.

Co-Authored-By: Claude Fable 5 <noreply@anthropic.com>
</commit_message>
<xml_diff>
--- a/docs/paper/paper_a/submission/cover_letter.docx
+++ b/docs/paper/paper_a/submission/cover_letter.docx
@@ -83,13 +83,19 @@
         <w:t xml:space="preserve"> </w:t>
       </w:r>
       <w:r>
-        <w:t xml:space="preserve">“An operational reconstruction</w:t>
-      </w:r>
-      <w:r>
-        <w:t xml:space="preserve"> </w:t>
-      </w:r>
-      <w:r>
-        <w:t xml:space="preserve">ladder for spacetime quantities from causal order,”</w:t>
+        <w:t xml:space="preserve">“Spacetime quantities from</w:t>
+      </w:r>
+      <w:r>
+        <w:t xml:space="preserve"> </w:t>
+      </w:r>
+      <w:r>
+        <w:t xml:space="preserve">causal order: an operational ladder with preregistered validations at</w:t>
+      </w:r>
+      <w:r>
+        <w:t xml:space="preserve"> </w:t>
+      </w:r>
+      <w:r>
+        <w:t xml:space="preserve">finite density,”</w:t>
       </w:r>
       <w:r>
         <w:t xml:space="preserve"> </w:t>

</xml_diff>

<commit_message>
Polish CQG submission package
</commit_message>
<xml_diff>
--- a/docs/paper/paper_a/submission/cover_letter.docx
+++ b/docs/paper/paper_a/submission/cover_letter.docx
@@ -2,86 +2,10 @@
 <file path=word/document.xml><?xml version="1.0" encoding="utf-8"?>
 <w:document xmlns:w="http://schemas.openxmlformats.org/wordprocessingml/2006/main" xmlns:m="http://schemas.openxmlformats.org/officeDocument/2006/math" xmlns:r="http://schemas.openxmlformats.org/officeDocument/2006/relationships" xmlns:o="urn:schemas-microsoft-com:office:office" xmlns:v="urn:schemas-microsoft-com:vml" xmlns:w10="urn:schemas-microsoft-com:office:word" xmlns:a="http://schemas.openxmlformats.org/drawingml/2006/main" xmlns:pic="http://schemas.openxmlformats.org/drawingml/2006/picture" xmlns:wp="http://schemas.openxmlformats.org/drawingml/2006/wordprocessingDrawing">
   <w:body>
-    <w:bookmarkStart w:id="13" w:name="X797f51a9834ae635831b81c39ea1faabb51e55c"/>
     <w:p>
       <w:pPr>
-        <w:pStyle w:val="Heading1"/>
-      </w:pPr>
-      <w:r>
-        <w:t xml:space="preserve">Cover letter (Classical and Quantum Gravity)</w:t>
-      </w:r>
-    </w:p>
-    <w:p>
-      <w:pPr>
         <w:pStyle w:val="FirstParagraph"/>
-      </w:pPr>
-      <w:r>
-        <w:rPr>
-          <w:i/>
-          <w:iCs/>
-        </w:rPr>
-        <w:t xml:space="preserve">Final text, rev. 5 — four rounds of review of the letter itself. This</w:t>
-      </w:r>
-      <w:r>
-        <w:rPr>
-          <w:i/>
-          <w:iCs/>
-        </w:rPr>
-        <w:t xml:space="preserve"> </w:t>
-      </w:r>
-      <w:r>
-        <w:rPr>
-          <w:i/>
-          <w:iCs/>
-        </w:rPr>
-        <w:t xml:space="preserve">round (colleague review): rewritten in plain language for a desk editor</w:t>
-      </w:r>
-      <w:r>
-        <w:rPr>
-          <w:i/>
-          <w:iCs/>
-        </w:rPr>
-        <w:t xml:space="preserve"> </w:t>
-      </w:r>
-      <w:r>
-        <w:rPr>
-          <w:i/>
-          <w:iCs/>
-        </w:rPr>
-        <w:t xml:space="preserve">who is likely not a causal-structure specialist — every term of art is</w:t>
-      </w:r>
-      <w:r>
-        <w:rPr>
-          <w:i/>
-          <w:iCs/>
-        </w:rPr>
-        <w:t xml:space="preserve"> </w:t>
-      </w:r>
-      <w:r>
-        <w:rPr>
-          <w:i/>
-          <w:iCs/>
-        </w:rPr>
-        <w:t xml:space="preserve">glossed at first use — and the concept figure added. Submission is</w:t>
-      </w:r>
-      <w:r>
-        <w:rPr>
-          <w:i/>
-          <w:iCs/>
-        </w:rPr>
-        <w:t xml:space="preserve"> </w:t>
-      </w:r>
-      <w:r>
-        <w:rPr>
-          <w:i/>
-          <w:iCs/>
-        </w:rPr>
-        <w:t xml:space="preserve">performed by the author.</w:t>
-      </w:r>
-    </w:p>
-    <w:p>
-      <w:pPr>
-        <w:pStyle w:val="BodyText"/>
+        <w:widowControl/>
       </w:pPr>
       <w:r>
         <w:t xml:space="preserve">Dear Editors of</w:t>
@@ -103,33 +27,22 @@
     <w:p>
       <w:pPr>
         <w:pStyle w:val="BodyText"/>
-      </w:pPr>
-      <w:r>
-        <w:t xml:space="preserve">Please consider the enclosed manuscript,</w:t>
-      </w:r>
-      <w:r>
-        <w:t xml:space="preserve"> </w:t>
-      </w:r>
-      <w:r>
-        <w:t xml:space="preserve">“Spacetime quantities from</w:t>
-      </w:r>
-      <w:r>
-        <w:t xml:space="preserve"> </w:t>
-      </w:r>
-      <w:r>
-        <w:t xml:space="preserve">causal order: an operational ladder with preregistered validations at</w:t>
-      </w:r>
-      <w:r>
-        <w:t xml:space="preserve"> </w:t>
-      </w:r>
-      <w:r>
-        <w:t xml:space="preserve">finite density,”</w:t>
-      </w:r>
-      <w:r>
-        <w:t xml:space="preserve"> </w:t>
-      </w:r>
-      <w:r>
-        <w:t xml:space="preserve">for publication in</w:t>
+        <w:widowControl/>
+      </w:pPr>
+      <w:r>
+        <w:t xml:space="preserve">Please consider my manuscript, “Spacetime quantities from causal order: an</w:t>
+      </w:r>
+      <w:r>
+        <w:t xml:space="preserve"> </w:t>
+      </w:r>
+      <w:r>
+        <w:t xml:space="preserve">operational ladder with preregistered validations at finite density,” for</w:t>
+      </w:r>
+      <w:r>
+        <w:t xml:space="preserve"> </w:t>
+      </w:r>
+      <w:r>
+        <w:t xml:space="preserve">publication in</w:t>
       </w:r>
       <w:r>
         <w:t xml:space="preserve"> </w:t>
@@ -145,769 +58,278 @@
         <w:t xml:space="preserve"> </w:t>
       </w:r>
       <w:r>
-        <w:t xml:space="preserve">as a</w:t>
-      </w:r>
-      <w:r>
-        <w:t xml:space="preserve"> </w:t>
-      </w:r>
-      <w:r>
-        <w:t xml:space="preserve">Paper.</w:t>
+        <w:t xml:space="preserve">as a Research Paper.</w:t>
       </w:r>
     </w:p>
     <w:p>
       <w:pPr>
         <w:pStyle w:val="BodyText"/>
-      </w:pPr>
-      <w:r>
-        <w:t xml:space="preserve">A standard result in Lorentzian geometry says that the causal structure</w:t>
-      </w:r>
-      <w:r>
-        <w:t xml:space="preserve"> </w:t>
-      </w:r>
-      <w:r>
-        <w:t xml:space="preserve">of a spacetime determines its conformal geometry — the pattern of light</w:t>
-      </w:r>
-      <w:r>
-        <w:t xml:space="preserve"> </w:t>
-      </w:r>
-      <w:r>
-        <w:t xml:space="preserve">cones — while volume information fixes the remaining scale. The</w:t>
-      </w:r>
-      <w:r>
-        <w:t xml:space="preserve"> </w:t>
-      </w:r>
-      <w:r>
-        <w:t xml:space="preserve">manuscript asks a more practical version of that statement: given only a</w:t>
-      </w:r>
-      <w:r>
-        <w:t xml:space="preserve"> </w:t>
-      </w:r>
-      <w:r>
-        <w:t xml:space="preserve">finite set of events and the causal order between them, which spacetime</w:t>
-      </w:r>
-      <w:r>
-        <w:t xml:space="preserve"> </w:t>
-      </w:r>
-      <w:r>
-        <w:t xml:space="preserve">quantities can actually be reconstructed, and what additional</w:t>
-      </w:r>
-      <w:r>
-        <w:t xml:space="preserve"> </w:t>
-      </w:r>
-      <w:r>
-        <w:t xml:space="preserve">information is needed for each one?</w:t>
+        <w:widowControl/>
+      </w:pPr>
+      <w:r>
+        <w:t xml:space="preserve">Causal structure determines conformal geometry, while volume information</w:t>
+      </w:r>
+      <w:r>
+        <w:t xml:space="preserve"> </w:t>
+      </w:r>
+      <w:r>
+        <w:t xml:space="preserve">fixes the remaining scale under standard hypotheses. The manuscript asks the</w:t>
+      </w:r>
+      <w:r>
+        <w:t xml:space="preserve"> </w:t>
+      </w:r>
+      <w:r>
+        <w:t xml:space="preserve">corresponding finite-data question: given events and their causal order, which</w:t>
+      </w:r>
+      <w:r>
+        <w:t xml:space="preserve"> </w:t>
+      </w:r>
+      <w:r>
+        <w:t xml:space="preserve">spacetime quantities can an explicit procedure reconstruct, what additional</w:t>
+      </w:r>
+      <w:r>
+        <w:t xml:space="preserve"> </w:t>
+      </w:r>
+      <w:r>
+        <w:t xml:space="preserve">information does each reconstruction require, and which ambiguities remain</w:t>
+      </w:r>
+      <w:r>
+        <w:t xml:space="preserve"> </w:t>
+      </w:r>
+      <w:r>
+        <w:t xml:space="preserve">when that information is absent?</w:t>
       </w:r>
     </w:p>
     <w:p>
       <w:pPr>
-        <w:pStyle w:val="CaptionedFigure"/>
-      </w:pPr>
-      <w:r>
-        <w:drawing>
-          <wp:inline>
-            <wp:extent cx="4572000" cy="2773180"/>
-            <wp:effectExtent b="0" l="0" r="0" t="0"/>
-            <wp:docPr descr="The manuscript’s central object: each row of the reconstruction hierarchy adds one declared ingredient and names the spacetime quantity it unlocks — and what that ingredient set still does not supply." title="" id="10" name="Picture"/>
-            <a:graphic>
-              <a:graphicData uri="http://schemas.openxmlformats.org/drawingml/2006/picture">
-                <pic:pic>
-                  <pic:nvPicPr>
-                    <pic:cNvPr descr="figures/png300/fig1_ladder.png" id="11" name="Picture"/>
-                    <pic:cNvPicPr>
-                      <a:picLocks noChangeArrowheads="1" noChangeAspect="1"/>
-                    </pic:cNvPicPr>
-                  </pic:nvPicPr>
-                  <pic:blipFill>
-                    <a:blip r:embed="rId9"/>
-                    <a:stretch>
-                      <a:fillRect/>
-                    </a:stretch>
-                  </pic:blipFill>
-                  <pic:spPr bwMode="auto">
-                    <a:xfrm>
-                      <a:off x="0" y="0"/>
-                      <a:ext cx="4572000" cy="2773180"/>
-                    </a:xfrm>
-                    <a:prstGeom prst="rect">
-                      <a:avLst/>
-                    </a:prstGeom>
-                    <a:noFill/>
-                    <a:ln w="9525">
-                      <a:noFill/>
-                      <a:headEnd/>
-                      <a:tailEnd/>
-                    </a:ln>
-                  </pic:spPr>
-                </pic:pic>
-              </a:graphicData>
-            </a:graphic>
-          </wp:inline>
-        </w:drawing>
+        <w:pStyle w:val="BodyText"/>
+        <w:widowControl/>
+      </w:pPr>
+      <w:r>
+        <w:t xml:space="preserve">The central contribution is a branched dependency ledger connecting causal</w:t>
+      </w:r>
+      <w:r>
+        <w:t xml:space="preserve"> </w:t>
+      </w:r>
+      <w:r>
+        <w:t xml:space="preserve">order to dimension estimates, proper-time calibration, radar coordinates,</w:t>
+      </w:r>
+      <w:r>
+        <w:t xml:space="preserve"> </w:t>
+      </w:r>
+      <w:r>
+        <w:t xml:space="preserve">oriented Lorentz maps, observer atlases, and measure-dependent volume</w:t>
+      </w:r>
+      <w:r>
+        <w:t xml:space="preserve"> </w:t>
+      </w:r>
+      <w:r>
+        <w:t xml:space="preserve">reconstruction. Each step names its supplied ingredient and reports its</w:t>
+      </w:r>
+      <w:r>
+        <w:t xml:space="preserve"> </w:t>
+      </w:r>
+      <w:r>
+        <w:t xml:space="preserve">finite-density behaviour. Three counterexamples set the boundary of the</w:t>
+      </w:r>
+      <w:r>
+        <w:t xml:space="preserve"> </w:t>
+      </w:r>
+      <w:r>
+        <w:t xml:space="preserve">ledger: order alone supplies no metric scale, a single observer leaves a</w:t>
+      </w:r>
+      <w:r>
+        <w:t xml:space="preserve"> </w:t>
+      </w:r>
+      <w:r>
+        <w:t xml:space="preserve">reflection ambiguity, and finite signal speed alone does not imply Lorentzian</w:t>
+      </w:r>
+      <w:r>
+        <w:t xml:space="preserve"> </w:t>
+      </w:r>
+      <w:r>
+        <w:t xml:space="preserve">geometry. A Rindler analogue gives the expected accessibility boundary.</w:t>
       </w:r>
     </w:p>
     <w:p>
       <w:pPr>
-        <w:pStyle w:val="ImageCaption"/>
-      </w:pPr>
-      <w:r>
-        <w:t xml:space="preserve">The manuscript’s central object: each row of the reconstruction</w:t>
-      </w:r>
-      <w:r>
-        <w:t xml:space="preserve"> </w:t>
-      </w:r>
-      <w:r>
-        <w:t xml:space="preserve">hierarchy adds one declared ingredient and names the spacetime quantity</w:t>
-      </w:r>
-      <w:r>
-        <w:t xml:space="preserve"> </w:t>
-      </w:r>
-      <w:r>
-        <w:t xml:space="preserve">it unlocks — and what that ingredient set still does not</w:t>
-      </w:r>
-      <w:r>
-        <w:t xml:space="preserve"> </w:t>
-      </w:r>
-      <w:r>
-        <w:t xml:space="preserve">supply.</w:t>
+        <w:pStyle w:val="BodyText"/>
+        <w:widowControl/>
+      </w:pPr>
+      <w:r>
+        <w:t xml:space="preserve">The manuscript also tests the framework in curved spacetime using</w:t>
+      </w:r>
+      <w:r>
+        <w:t xml:space="preserve"> </w:t>
+      </w:r>
+      <w:r>
+        <w:t xml:space="preserve">preregistered numerical stages. In a vacuum plane wave whose coordinate volume form and Poisson</w:t>
+      </w:r>
+      <w:r>
+        <w:t xml:space="preserve"> </w:t>
+      </w:r>
+      <w:r>
+        <w:t xml:space="preserve">sprinkling law are exactly those of the flat comparator, an order-only</w:t>
+      </w:r>
+      <w:r>
+        <w:t xml:space="preserve"> </w:t>
+      </w:r>
+      <w:r>
+        <w:t xml:space="preserve">statistic detects a deliberately strong pure-Weyl deformation at finite</w:t>
+      </w:r>
+      <w:r>
+        <w:t xml:space="preserve"> </w:t>
+      </w:r>
+      <w:r>
+        <w:t xml:space="preserve">density. Separate stages on a frozen Schwarzschild exterior patch confirm the</w:t>
+      </w:r>
+      <w:r>
+        <w:t xml:space="preserve"> </w:t>
+      </w:r>
+      <w:r>
+        <w:t xml:space="preserve">paired causal-relation shift and detect single-poset discrimination with</w:t>
+      </w:r>
+      <w:r>
+        <w:t xml:space="preserve"> </w:t>
+      </w:r>
+      <w:r>
+        <w:t xml:space="preserve">incomplete separation. Finally, a four-rung mass ladder compares sprinkled</w:t>
+      </w:r>
+      <w:r>
+        <w:t xml:space="preserve"> </w:t>
+      </w:r>
+      <w:r>
+        <w:t xml:space="preserve">counts with independently certified continuum four-volumes under a frozen</w:t>
+      </w:r>
+      <w:r>
+        <w:t xml:space="preserve"> </w:t>
+      </w:r>
+      <w:r>
+        <w:t xml:space="preserve">2.5% equivalence rule. These results are presented as controlled validations</w:t>
+      </w:r>
+      <w:r>
+        <w:t xml:space="preserve"> </w:t>
+      </w:r>
+      <w:r>
+        <w:t xml:space="preserve">of reconstruction procedures at specified operating points, not as evidence</w:t>
+      </w:r>
+      <w:r>
+        <w:t xml:space="preserve"> </w:t>
+      </w:r>
+      <w:r>
+        <w:t xml:space="preserve">that spacetime is discrete or reducible to causal order.</w:t>
       </w:r>
     </w:p>
     <w:p>
       <w:pPr>
         <w:pStyle w:val="BodyText"/>
-      </w:pPr>
-      <w:r>
-        <w:t xml:space="preserve">We answer with a step-by-step reconstruction hierarchy, summarized in</w:t>
-      </w:r>
-      <w:r>
-        <w:t xml:space="preserve"> </w:t>
-      </w:r>
-      <w:r>
-        <w:t xml:space="preserve">the figure above.</w:t>
-      </w:r>
-      <w:r>
-        <w:t xml:space="preserve"> </w:t>
-      </w:r>
-      <w:r>
-        <w:t xml:space="preserve">Starting from causal order alone, we add one declared ingredient at a</w:t>
-      </w:r>
-      <w:r>
-        <w:t xml:space="preserve"> </w:t>
-      </w:r>
-      <w:r>
-        <w:t xml:space="preserve">time — an overall event density, an observer’s clock, an orientation</w:t>
-      </w:r>
-      <w:r>
-        <w:t xml:space="preserve"> </w:t>
-      </w:r>
-      <w:r>
-        <w:t xml:space="preserve">reference, overlapping observer charts, a local volume profile — and</w:t>
-      </w:r>
-      <w:r>
-        <w:t xml:space="preserve"> </w:t>
-      </w:r>
-      <w:r>
-        <w:t xml:space="preserve">measure what becomes recoverable at each step, with its error at finite</w:t>
-      </w:r>
-      <w:r>
-        <w:t xml:space="preserve"> </w:t>
-      </w:r>
-      <w:r>
-        <w:t xml:space="preserve">sampling density. Just as importantly, we show what cannot be recovered</w:t>
-      </w:r>
-      <w:r>
-        <w:t xml:space="preserve"> </w:t>
-      </w:r>
-      <w:r>
-        <w:t xml:space="preserve">while an ingredient is missing: causal order alone determines neither</w:t>
-      </w:r>
-      <w:r>
-        <w:t xml:space="preserve"> </w:t>
-      </w:r>
-      <w:r>
-        <w:t xml:space="preserve">the overall scale nor how the volume element varies from place to place;</w:t>
-      </w:r>
-      <w:r>
-        <w:t xml:space="preserve"> </w:t>
-      </w:r>
-      <w:r>
-        <w:t xml:space="preserve">a single observer cannot tell left from right (a reflection ambiguity);</w:t>
-      </w:r>
-      <w:r>
-        <w:t xml:space="preserve"> </w:t>
-      </w:r>
-      <w:r>
-        <w:t xml:space="preserve">and a finite signal speed by itself does not produce Lorentzian</w:t>
-      </w:r>
-      <w:r>
-        <w:t xml:space="preserve"> </w:t>
-      </w:r>
-      <w:r>
-        <w:t xml:space="preserve">geometry.</w:t>
+        <w:widowControl/>
+      </w:pPr>
+      <w:r>
+        <w:t xml:space="preserve">I believe the manuscript fits CQG because it connects Lorentzian causal</w:t>
+      </w:r>
+      <w:r>
+        <w:t xml:space="preserve"> </w:t>
+      </w:r>
+      <w:r>
+        <w:t xml:space="preserve">structure, discrete-spacetime methods, black-hole exterior numerics, and</w:t>
+      </w:r>
+      <w:r>
+        <w:t xml:space="preserve"> </w:t>
+      </w:r>
+      <w:r>
+        <w:t xml:space="preserve">operational measurement while placing the results in their wider</w:t>
+      </w:r>
+      <w:r>
+        <w:t xml:space="preserve"> </w:t>
+      </w:r>
+      <w:r>
+        <w:t xml:space="preserve">gravitational-physics context. The evidence trail is auditable: decision rules</w:t>
+      </w:r>
+      <w:r>
+        <w:t xml:space="preserve"> </w:t>
+      </w:r>
+      <w:r>
+        <w:t xml:space="preserve">for the curved-space stages were archived before execution, reported figures</w:t>
+      </w:r>
+      <w:r>
+        <w:t xml:space="preserve"> </w:t>
+      </w:r>
+      <w:r>
+        <w:t xml:space="preserve">are regenerated from version-controlled artifacts, and the manuscript states</w:t>
+      </w:r>
+      <w:r>
+        <w:t xml:space="preserve"> </w:t>
+      </w:r>
+      <w:r>
+        <w:t xml:space="preserve">the limitations of every primary verdict.</w:t>
       </w:r>
     </w:p>
     <w:p>
       <w:pPr>
         <w:pStyle w:val="BodyText"/>
-      </w:pPr>
-      <w:r>
-        <w:t xml:space="preserve">We then test the framework in curved spacetime, in numerical experiments</w:t>
-      </w:r>
-      <w:r>
-        <w:t xml:space="preserve"> </w:t>
-      </w:r>
-      <w:r>
-        <w:t xml:space="preserve">that were preregistered: every decision rule was fixed and archived</w:t>
-      </w:r>
-      <w:r>
-        <w:t xml:space="preserve"> </w:t>
-      </w:r>
-      <w:r>
-        <w:t xml:space="preserve">before the data were generated. The first test uses a vacuum plane wave</w:t>
-      </w:r>
-      <w:r>
-        <w:t xml:space="preserve"> </w:t>
-      </w:r>
-      <w:r>
-        <w:t xml:space="preserve">built so that the volume element and the random placement of events (a</w:t>
-      </w:r>
-      <w:r>
-        <w:t xml:space="preserve"> </w:t>
-      </w:r>
-      <w:r>
-        <w:t xml:space="preserve">Poisson</w:t>
-      </w:r>
-      <w:r>
-        <w:t xml:space="preserve"> </w:t>
-      </w:r>
-      <w:r>
-        <w:t xml:space="preserve">“sprinkling”</w:t>
-      </w:r>
-      <w:r>
-        <w:t xml:space="preserve">) are exactly the same as in flat spacetime, and</w:t>
-      </w:r>
-      <w:r>
-        <w:t xml:space="preserve"> </w:t>
-      </w:r>
-      <w:r>
-        <w:t xml:space="preserve">only the light cones change. Even at finite sampling density, a</w:t>
-      </w:r>
-      <w:r>
-        <w:t xml:space="preserve"> </w:t>
-      </w:r>
-      <w:r>
-        <w:t xml:space="preserve">statistic computed from the causal order alone separates the flat and</w:t>
-      </w:r>
-      <w:r>
-        <w:t xml:space="preserve"> </w:t>
-      </w:r>
-      <w:r>
-        <w:t xml:space="preserve">curved ensembles — and since nothing about the volume differs, the</w:t>
-      </w:r>
-      <w:r>
-        <w:t xml:space="preserve"> </w:t>
-      </w:r>
-      <w:r>
-        <w:t xml:space="preserve">signal cannot be attributed to volume effects. Matching tests on a</w:t>
-      </w:r>
-      <w:r>
-        <w:t xml:space="preserve"> </w:t>
-      </w:r>
-      <w:r>
-        <w:t xml:space="preserve">Schwarzschild exterior region confirm the same light-cone effect in a</w:t>
-      </w:r>
-      <w:r>
-        <w:t xml:space="preserve"> </w:t>
-      </w:r>
-      <w:r>
-        <w:t xml:space="preserve">paired design and show that a single sampled set already discriminates</w:t>
-      </w:r>
-      <w:r>
-        <w:t xml:space="preserve"> </w:t>
-      </w:r>
-      <w:r>
-        <w:t xml:space="preserve">the two geometries above chance. A final four-mass series then turns to</w:t>
-      </w:r>
-      <w:r>
-        <w:t xml:space="preserve"> </w:t>
-      </w:r>
-      <w:r>
-        <w:t xml:space="preserve">the volume half of the standard result: event counts from sprinkling</w:t>
-      </w:r>
-      <w:r>
-        <w:t xml:space="preserve"> </w:t>
-      </w:r>
-      <w:r>
-        <w:t xml:space="preserve">agree, within a preregistered 2.5% tolerance, with continuum</w:t>
-      </w:r>
-      <w:r>
-        <w:t xml:space="preserve"> </w:t>
-      </w:r>
-      <w:r>
-        <w:t xml:space="preserve">four-volumes certified in advance by interval arithmetic (computer</w:t>
-      </w:r>
-      <w:r>
-        <w:t xml:space="preserve"> </w:t>
-      </w:r>
-      <w:r>
-        <w:t xml:space="preserve">arithmetic that carries guaranteed error bounds) — so the comparison</w:t>
-      </w:r>
-      <w:r>
-        <w:t xml:space="preserve"> </w:t>
-      </w:r>
-      <w:r>
-        <w:t xml:space="preserve">runs against a certified prediction rather than a tuned margin.</w:t>
+        <w:widowControl/>
+      </w:pPr>
+      <w:r>
+        <w:t xml:space="preserve">The manuscript is original, has not been published previously, and is not</w:t>
+      </w:r>
+      <w:r>
+        <w:t xml:space="preserve"> </w:t>
+      </w:r>
+      <w:r>
+        <w:t xml:space="preserve">under consideration elsewhere. There are no conflicts of interest. The code</w:t>
+      </w:r>
+      <w:r>
+        <w:t xml:space="preserve"> </w:t>
+      </w:r>
+      <w:r>
+        <w:t xml:space="preserve">and supporting data are identified in the Data Availability Statement.</w:t>
       </w:r>
     </w:p>
     <w:p>
       <w:pPr>
         <w:pStyle w:val="BodyText"/>
-      </w:pPr>
-      <w:r>
-        <w:t xml:space="preserve">We believe the manuscript is well suited to</w:t>
-      </w:r>
-      <w:r>
-        <w:t xml:space="preserve"> </w:t>
-      </w:r>
-      <w:r>
-        <w:rPr>
-          <w:i/>
-          <w:iCs/>
-        </w:rPr>
-        <w:t xml:space="preserve">Classical and Quantum</w:t>
-      </w:r>
-      <w:r>
-        <w:rPr>
-          <w:i/>
-          <w:iCs/>
-        </w:rPr>
-        <w:t xml:space="preserve"> </w:t>
-      </w:r>
-      <w:r>
-        <w:rPr>
-          <w:i/>
-          <w:iCs/>
-        </w:rPr>
-        <w:t xml:space="preserve">Gravity</w:t>
-      </w:r>
-      <w:r>
-        <w:t xml:space="preserve"> </w:t>
-      </w:r>
-      <w:r>
-        <w:t xml:space="preserve">because it directly addresses the relation between causal</w:t>
-      </w:r>
-      <w:r>
-        <w:t xml:space="preserve"> </w:t>
-      </w:r>
-      <w:r>
-        <w:t xml:space="preserve">structure and spacetime geometry, and the reconstruction of continuum</w:t>
-      </w:r>
-      <w:r>
-        <w:t xml:space="preserve"> </w:t>
-      </w:r>
-      <w:r>
-        <w:t xml:space="preserve">geometry from discrete data. Its contribution is to make that</w:t>
-      </w:r>
-      <w:r>
-        <w:t xml:space="preserve"> </w:t>
-      </w:r>
-      <w:r>
-        <w:t xml:space="preserve">reconstruction operational: what can be recovered from finite causal</w:t>
-      </w:r>
-      <w:r>
-        <w:t xml:space="preserve"> </w:t>
-      </w:r>
-      <w:r>
-        <w:t xml:space="preserve">data, what extra information each step requires, and what ambiguities</w:t>
-      </w:r>
-      <w:r>
-        <w:t xml:space="preserve"> </w:t>
-      </w:r>
-      <w:r>
-        <w:t xml:space="preserve">remain when that information is absent — with the curved-spacetime tests</w:t>
-      </w:r>
-      <w:r>
-        <w:t xml:space="preserve"> </w:t>
-      </w:r>
-      <w:r>
-        <w:t xml:space="preserve">showing how these statements behave at finite density rather than only</w:t>
-      </w:r>
-      <w:r>
-        <w:t xml:space="preserve"> </w:t>
-      </w:r>
-      <w:r>
-        <w:t xml:space="preserve">in an ideal continuum limit. The computational claims are fully</w:t>
-      </w:r>
-      <w:r>
-        <w:t xml:space="preserve"> </w:t>
-      </w:r>
-      <w:r>
-        <w:t xml:space="preserve">auditable: the decision rules were archived before execution, the</w:t>
-      </w:r>
-      <w:r>
-        <w:t xml:space="preserve"> </w:t>
-      </w:r>
-      <w:r>
-        <w:t xml:space="preserve">numerical evidence is version-controlled in a public repository, and</w:t>
-      </w:r>
-      <w:r>
-        <w:t xml:space="preserve"> </w:t>
-      </w:r>
-      <w:r>
-        <w:t xml:space="preserve">automated checks rebuild the reported figures from the archived data.</w:t>
+        <w:widowControl/>
+      </w:pPr>
+      <w:r>
+        <w:t xml:space="preserve">Thank you for your consideration.</w:t>
       </w:r>
     </w:p>
     <w:p>
       <w:pPr>
         <w:pStyle w:val="BodyText"/>
-      </w:pPr>
-      <w:r>
-        <w:t xml:space="preserve">The manuscript is original, has not been published previously, and is</w:t>
-      </w:r>
-      <w:r>
-        <w:t xml:space="preserve"> </w:t>
-      </w:r>
-      <w:r>
-        <w:t xml:space="preserve">not under consideration elsewhere. There are no conflicts of interest.</w:t>
-      </w:r>
-      <w:r>
-        <w:t xml:space="preserve"> </w:t>
-      </w:r>
-      <w:r>
-        <w:t xml:space="preserve">Supporting data are cited in the Data Availability Statement. The use of</w:t>
-      </w:r>
-      <w:r>
-        <w:t xml:space="preserve"> </w:t>
-      </w:r>
-      <w:r>
-        <w:t xml:space="preserve">AI assistance in this work is disclosed in the Acknowledgements, per IOP</w:t>
-      </w:r>
-      <w:r>
-        <w:t xml:space="preserve"> </w:t>
-      </w:r>
-      <w:r>
-        <w:t xml:space="preserve">policy.</w:t>
+        <w:widowControl/>
+      </w:pPr>
+      <w:r>
+        <w:t xml:space="preserve">Sincerely,</w:t>
       </w:r>
     </w:p>
     <w:p>
       <w:pPr>
         <w:pStyle w:val="BodyText"/>
-      </w:pPr>
-      <w:r>
-        <w:t xml:space="preserve">Thank you for your consideration.</w:t>
+        <w:widowControl/>
+      </w:pPr>
+      <w:r>
+        <w:t xml:space="preserve">Juneyoung Kim</w:t>
+      </w:r>
+      <w:r>
+        <w:br/>
+      </w:r>
+      <w:r>
+        <w:t xml:space="preserve">Independent researcher</w:t>
+      </w:r>
+      <w:r>
+        <w:br/>
+      </w:r>
+      <w:r>
+        <w:t xml:space="preserve">lpaiu.cs@gmail.com</w:t>
       </w:r>
     </w:p>
-    <w:p>
-      <w:pPr>
-        <w:pStyle w:val="BodyText"/>
-      </w:pPr>
-      <w:r>
-        <w:t xml:space="preserve">Sincerely,</w:t>
-      </w:r>
-    </w:p>
-    <w:p>
-      <w:pPr>
-        <w:pStyle w:val="BodyText"/>
-      </w:pPr>
-      <w:r>
-        <w:t xml:space="preserve">Juneyoung Kim</w:t>
-      </w:r>
-      <w:r>
-        <w:br/>
-      </w:r>
-      <w:r>
-        <w:t xml:space="preserve">Independent researcher</w:t>
-      </w:r>
-      <w:r>
-        <w:br/>
-      </w:r>
-      <w:r>
-        <w:t xml:space="preserve">lpaiu.cs@gmail.com</w:t>
-      </w:r>
-    </w:p>
-    <w:p>
-      <w:r>
-        <w:pict>
-          <v:rect style="width:0;height:1.5pt" o:hralign="center" o:hrstd="t" o:hr="t"/>
-        </w:pict>
-      </w:r>
-    </w:p>
-    <w:bookmarkStart w:id="12" w:name="Xea3578bb1754a16058fae0cb7075c35099728ff"/>
-    <w:p>
-      <w:pPr>
-        <w:pStyle w:val="Heading2"/>
-      </w:pPr>
-      <w:r>
-        <w:t xml:space="preserve">Submission-form extras (not part of the letter)</w:t>
-      </w:r>
-    </w:p>
-    <w:p>
-      <w:pPr>
-        <w:pStyle w:val="FirstParagraph"/>
-      </w:pPr>
-      <w:r>
-        <w:rPr>
-          <w:b/>
-          <w:bCs/>
-        </w:rPr>
-        <w:t xml:space="preserve">Article type:</w:t>
-      </w:r>
-      <w:r>
-        <w:t xml:space="preserve"> </w:t>
-      </w:r>
-      <w:r>
-        <w:t xml:space="preserve">Paper.</w:t>
-      </w:r>
-    </w:p>
-    <w:p>
-      <w:pPr>
-        <w:pStyle w:val="BodyText"/>
-      </w:pPr>
-      <w:r>
-        <w:rPr>
-          <w:b/>
-          <w:bCs/>
-        </w:rPr>
-        <w:t xml:space="preserve">Related manuscripts:</w:t>
-      </w:r>
-      <w:r>
-        <w:t xml:space="preserve"> </w:t>
-      </w:r>
-      <w:r>
-        <w:t xml:space="preserve">none under consideration anywhere. Form-ready</w:t>
-      </w:r>
-      <w:r>
-        <w:t xml:space="preserve"> </w:t>
-      </w:r>
-      <w:r>
-        <w:t xml:space="preserve">sentence, if asked:</w:t>
-      </w:r>
-      <w:r>
-        <w:t xml:space="preserve"> </w:t>
-      </w:r>
-      <w:r>
-        <w:t xml:space="preserve">“A companion study building a discriminator on this</w:t>
-      </w:r>
-      <w:r>
-        <w:t xml:space="preserve"> </w:t>
-      </w:r>
-      <w:r>
-        <w:t xml:space="preserve">foundation is in preparation and unsubmitted; the present manuscript is</w:t>
-      </w:r>
-      <w:r>
-        <w:t xml:space="preserve"> </w:t>
-      </w:r>
-      <w:r>
-        <w:t xml:space="preserve">self-contained and does not depend on it.”</w:t>
-      </w:r>
-      <w:r>
-        <w:t xml:space="preserve"> </w:t>
-      </w:r>
-      <w:r>
-        <w:t xml:space="preserve">(The manuscript’s Discussion</w:t>
-      </w:r>
-      <w:r>
-        <w:t xml:space="preserve"> </w:t>
-      </w:r>
-      <w:r>
-        <w:t xml:space="preserve">names it once.)</w:t>
-      </w:r>
-    </w:p>
-    <w:p>
-      <w:pPr>
-        <w:pStyle w:val="BodyText"/>
-      </w:pPr>
-      <w:r>
-        <w:rPr>
-          <w:b/>
-          <w:bCs/>
-        </w:rPr>
-        <w:t xml:space="preserve">Suggested reviewers.</w:t>
-      </w:r>
-      <w:r>
-        <w:t xml:space="preserve"> </w:t>
-      </w:r>
-      <w:r>
-        <w:t xml:space="preserve">Before entering them on the form: verify each</w:t>
-      </w:r>
-      <w:r>
-        <w:t xml:space="preserve"> </w:t>
-      </w:r>
-      <w:r>
-        <w:t xml:space="preserve">person’s current affiliation and e-mail from their institutional page,</w:t>
-      </w:r>
-      <w:r>
-        <w:t xml:space="preserve"> </w:t>
-      </w:r>
-      <w:r>
-        <w:t xml:space="preserve">and check for recent co-authorship, shared institutions, or other</w:t>
-      </w:r>
-      <w:r>
-        <w:t xml:space="preserve"> </w:t>
-      </w:r>
-      <w:r>
-        <w:t xml:space="preserve">conflicts. Final selection is editorial.</w:t>
-      </w:r>
-    </w:p>
-    <w:p>
-      <w:pPr>
-        <w:pStyle w:val="Compact"/>
-        <w:numPr>
-          <w:ilvl w:val="0"/>
-          <w:numId w:val="1001"/>
-        </w:numPr>
-      </w:pPr>
-      <w:r>
-        <w:t xml:space="preserve">Sumati Surya — author of the</w:t>
-      </w:r>
-      <w:r>
-        <w:t xml:space="preserve"> </w:t>
-      </w:r>
-      <w:r>
-        <w:rPr>
-          <w:i/>
-          <w:iCs/>
-        </w:rPr>
-        <w:t xml:space="preserve">Living Reviews in Relativity</w:t>
-      </w:r>
-      <w:r>
-        <w:t xml:space="preserve"> </w:t>
-      </w:r>
-      <w:r>
-        <w:t xml:space="preserve">survey of</w:t>
-      </w:r>
-      <w:r>
-        <w:t xml:space="preserve"> </w:t>
-      </w:r>
-      <w:r>
-        <w:t xml:space="preserve">causal set theory and of the small-diamond discrete-geometry results</w:t>
-      </w:r>
-      <w:r>
-        <w:t xml:space="preserve"> </w:t>
-      </w:r>
-      <w:r>
-        <w:t xml:space="preserve">the count stage is positioned against.</w:t>
-      </w:r>
-    </w:p>
-    <w:p>
-      <w:pPr>
-        <w:pStyle w:val="Compact"/>
-        <w:numPr>
-          <w:ilvl w:val="0"/>
-          <w:numId w:val="1001"/>
-        </w:numPr>
-      </w:pPr>
-      <w:r>
-        <w:t xml:space="preserve">Fay Dowker — co-author of the Lorentz-invariance/discreteness argument</w:t>
-      </w:r>
-      <w:r>
-        <w:t xml:space="preserve"> </w:t>
-      </w:r>
-      <w:r>
-        <w:t xml:space="preserve">and of the Benincasa-Dowker curvature estimator the manuscript names</w:t>
-      </w:r>
-      <w:r>
-        <w:t xml:space="preserve"> </w:t>
-      </w:r>
-      <w:r>
-        <w:t xml:space="preserve">as the complementary channel.</w:t>
-      </w:r>
-    </w:p>
-    <w:p>
-      <w:pPr>
-        <w:pStyle w:val="Compact"/>
-        <w:numPr>
-          <w:ilvl w:val="0"/>
-          <w:numId w:val="1001"/>
-        </w:numPr>
-      </w:pPr>
-      <w:r>
-        <w:t xml:space="preserve">David Rideout — co-author of the Schwarzschild causal-relation</w:t>
-      </w:r>
-      <w:r>
-        <w:t xml:space="preserve"> </w:t>
-      </w:r>
-      <w:r>
-        <w:t xml:space="preserve">algorithm (He-Rideout) the manuscript’s exact predicate is checked</w:t>
-      </w:r>
-      <w:r>
-        <w:t xml:space="preserve"> </w:t>
-      </w:r>
-      <w:r>
-        <w:t xml:space="preserve">against, and of large-scale causal set numerics.</w:t>
-      </w:r>
-    </w:p>
-    <w:p>
-      <w:pPr>
-        <w:pStyle w:val="Compact"/>
-        <w:numPr>
-          <w:ilvl w:val="0"/>
-          <w:numId w:val="1001"/>
-        </w:numPr>
-      </w:pPr>
-      <w:r>
-        <w:t xml:space="preserve">Lisa Glaser — causal set numerics and discrete d’Alembertians;</w:t>
-      </w:r>
-      <w:r>
-        <w:t xml:space="preserve"> </w:t>
-      </w:r>
-      <w:r>
-        <w:t xml:space="preserve">well placed to judge the estimator-side claims.</w:t>
-      </w:r>
-    </w:p>
-    <w:p>
-      <w:pPr>
-        <w:pStyle w:val="Compact"/>
-        <w:numPr>
-          <w:ilvl w:val="0"/>
-          <w:numId w:val="1001"/>
-        </w:numPr>
-      </w:pPr>
-      <w:r>
-        <w:t xml:space="preserve">(optional, if the form allows a fifth) Renate Loll — causal dynamical</w:t>
-      </w:r>
-      <w:r>
-        <w:t xml:space="preserve"> </w:t>
-      </w:r>
-      <w:r>
-        <w:t xml:space="preserve">triangulations; a neighbouring discrete Lorentzian programme, well</w:t>
-      </w:r>
-      <w:r>
-        <w:t xml:space="preserve"> </w:t>
-      </w:r>
-      <w:r>
-        <w:t xml:space="preserve">placed to judge the manuscript’s broader spacetime-reconstruction</w:t>
-      </w:r>
-      <w:r>
-        <w:t xml:space="preserve"> </w:t>
-      </w:r>
-      <w:r>
-        <w:t xml:space="preserve">positioning rather than its causal-set internals.</w:t>
-      </w:r>
-    </w:p>
-    <w:p>
-      <w:pPr>
-        <w:pStyle w:val="FirstParagraph"/>
-      </w:pPr>
-      <w:r>
-        <w:rPr>
-          <w:b/>
-          <w:bCs/>
-        </w:rPr>
-        <w:t xml:space="preserve">Opposed reviewers:</w:t>
-      </w:r>
-      <w:r>
-        <w:t xml:space="preserve"> </w:t>
-      </w:r>
-      <w:r>
-        <w:t xml:space="preserve">none.</w:t>
-      </w:r>
-    </w:p>
-    <w:bookmarkEnd w:id="12"/>
-    <w:bookmarkEnd w:id="13"/>
     <w:sectPr>
       <w:footnotePr>
         <w:numRestart w:val="eachSect"/>
       </w:footnotePr>
+      <w:pgMar w:top="1224" w:bottom="1224" w:left="1440" w:right="1440"/>
     </w:sectPr>
   </w:body>
 </w:document>
@@ -1014,123 +436,8 @@
       </w:pPr>
     </w:lvl>
   </w:abstractNum>
-  <w:abstractNum w:abstractNumId="99411">
-    <w:nsid w:val="00A99411"/>
-    <w:multiLevelType w:val="multilevel"/>
-    <w:lvl w:ilvl="0">
-      <w:start w:val="1"/>
-      <w:numFmt w:val="decimal"/>
-      <w:lvlText w:val="%1."/>
-      <w:lvlJc w:val="left"/>
-      <w:pPr>
-        <w:ind w:left="720" w:hanging="360"/>
-      </w:pPr>
-    </w:lvl>
-    <w:lvl w:ilvl="1">
-      <w:start w:val="1"/>
-      <w:numFmt w:val="decimal"/>
-      <w:lvlText w:val="%2."/>
-      <w:lvlJc w:val="left"/>
-      <w:pPr>
-        <w:ind w:left="1440" w:hanging="360"/>
-      </w:pPr>
-    </w:lvl>
-    <w:lvl w:ilvl="2">
-      <w:start w:val="1"/>
-      <w:numFmt w:val="decimal"/>
-      <w:lvlText w:val="%3."/>
-      <w:lvlJc w:val="left"/>
-      <w:pPr>
-        <w:ind w:left="2160" w:hanging="360"/>
-      </w:pPr>
-    </w:lvl>
-    <w:lvl w:ilvl="3">
-      <w:start w:val="1"/>
-      <w:numFmt w:val="decimal"/>
-      <w:lvlText w:val="%4."/>
-      <w:lvlJc w:val="left"/>
-      <w:pPr>
-        <w:ind w:left="2880" w:hanging="360"/>
-      </w:pPr>
-    </w:lvl>
-    <w:lvl w:ilvl="4">
-      <w:start w:val="1"/>
-      <w:numFmt w:val="decimal"/>
-      <w:lvlText w:val="%5."/>
-      <w:lvlJc w:val="left"/>
-      <w:pPr>
-        <w:ind w:left="3600" w:hanging="360"/>
-      </w:pPr>
-    </w:lvl>
-    <w:lvl w:ilvl="5">
-      <w:start w:val="1"/>
-      <w:numFmt w:val="decimal"/>
-      <w:lvlText w:val="%6."/>
-      <w:lvlJc w:val="left"/>
-      <w:pPr>
-        <w:ind w:left="4320" w:hanging="360"/>
-      </w:pPr>
-    </w:lvl>
-    <w:lvl w:ilvl="6">
-      <w:start w:val="1"/>
-      <w:numFmt w:val="decimal"/>
-      <w:lvlText w:val="%7."/>
-      <w:lvlJc w:val="left"/>
-      <w:pPr>
-        <w:ind w:left="5040" w:hanging="360"/>
-      </w:pPr>
-    </w:lvl>
-    <w:lvl w:ilvl="7">
-      <w:start w:val="1"/>
-      <w:numFmt w:val="decimal"/>
-      <w:lvlText w:val="%8."/>
-      <w:lvlJc w:val="left"/>
-      <w:pPr>
-        <w:ind w:left="5760" w:hanging="360"/>
-      </w:pPr>
-    </w:lvl>
-    <w:lvl w:ilvl="8">
-      <w:start w:val="1"/>
-      <w:numFmt w:val="decimal"/>
-      <w:lvlText w:val="%9."/>
-      <w:lvlJc w:val="left"/>
-      <w:pPr>
-        <w:ind w:left="6480" w:hanging="360"/>
-      </w:pPr>
-    </w:lvl>
-  </w:abstractNum>
   <w:num w:numId="1000">
     <w:abstractNumId w:val="990"/>
-  </w:num>
-  <w:num w:numId="1001">
-    <w:abstractNumId w:val="99411"/>
-    <w:lvlOverride w:ilvl="0">
-      <w:startOverride w:val="1"/>
-    </w:lvlOverride>
-    <w:lvlOverride w:ilvl="1">
-      <w:startOverride w:val="1"/>
-    </w:lvlOverride>
-    <w:lvlOverride w:ilvl="2">
-      <w:startOverride w:val="1"/>
-    </w:lvlOverride>
-    <w:lvlOverride w:ilvl="3">
-      <w:startOverride w:val="1"/>
-    </w:lvlOverride>
-    <w:lvlOverride w:ilvl="4">
-      <w:startOverride w:val="1"/>
-    </w:lvlOverride>
-    <w:lvlOverride w:ilvl="5">
-      <w:startOverride w:val="1"/>
-    </w:lvlOverride>
-    <w:lvlOverride w:ilvl="6">
-      <w:startOverride w:val="1"/>
-    </w:lvlOverride>
-    <w:lvlOverride w:ilvl="7">
-      <w:startOverride w:val="1"/>
-    </w:lvlOverride>
-    <w:lvlOverride w:ilvl="8">
-      <w:startOverride w:val="1"/>
-    </w:lvlOverride>
   </w:num>
 </w:numbering>
 </file>
@@ -1156,6 +463,13 @@
   <w:style w:default="1" w:styleId="Normal" w:type="paragraph">
     <w:name w:val="Normal"/>
     <w:qFormat/>
+    <w:pPr>
+      <w:spacing w:after="140" w:line="252" w:lineRule="auto"/>
+    </w:pPr>
+    <w:rPr>
+      <w:rFonts w:ascii="Times New Roman" w:hAnsi="Times New Roman"/>
+      <w:sz w:val="22"/>
+    </w:rPr>
   </w:style>
   <w:style w:styleId="BodyText" w:type="paragraph">
     <w:name w:val="Body Text"/>

</xml_diff>

<commit_message>
Add illustrated CQG cover letter
</commit_message>
<xml_diff>
--- a/docs/paper/paper_a/submission/cover_letter.docx
+++ b/docs/paper/paper_a/submission/cover_letter.docx
@@ -79,76 +79,180 @@
         <w:t xml:space="preserve"> </w:t>
       </w:r>
       <w:r>
-        <w:t xml:space="preserve">corresponding finite-data question: given events and their causal order, which</w:t>
-      </w:r>
-      <w:r>
-        <w:t xml:space="preserve"> </w:t>
-      </w:r>
-      <w:r>
-        <w:t xml:space="preserve">spacetime quantities can an explicit procedure reconstruct, what additional</w:t>
-      </w:r>
-      <w:r>
-        <w:t xml:space="preserve"> </w:t>
-      </w:r>
-      <w:r>
-        <w:t xml:space="preserve">information does each reconstruction require, and which ambiguities remain</w:t>
-      </w:r>
-      <w:r>
-        <w:t xml:space="preserve"> </w:t>
-      </w:r>
-      <w:r>
-        <w:t xml:space="preserve">when that information is absent?</w:t>
+        <w:t xml:space="preserve">corresponding finite-data question: which spacetime quantities can explicit</w:t>
+      </w:r>
+      <w:r>
+        <w:t xml:space="preserve"> </w:t>
+      </w:r>
+      <w:r>
+        <w:t xml:space="preserve">procedures reconstruct from events and causal order, what additional structure</w:t>
+      </w:r>
+      <w:r>
+        <w:t xml:space="preserve"> </w:t>
+      </w:r>
+      <w:r>
+        <w:t xml:space="preserve">does each require, and what remains ambiguous when that structure is absent?</w:t>
       </w:r>
     </w:p>
     <w:p>
       <w:pPr>
+        <w:pStyle w:val="CaptionedFigure"/>
+        <w:keepNext/>
+        <w:widowControl/>
+        <w:spacing w:before="20" w:after="0"/>
+        <w:jc w:val="center"/>
+      </w:pPr>
+      <w:r>
+        <w:drawing>
+          <wp:inline>
+            <wp:extent cx="5334000" cy="1778000"/>
+            <wp:effectExtent b="0" l="0" r="0" t="0"/>
+            <wp:docPr descr="From causal order to operational geometry: declared structure enables specific reconstructions (top), tested in a plane wave, a Schwarzschild exterior, and a four-rung count/volume ladder (bottom)." title="" id="10" name="Picture"/>
+            <a:graphic>
+              <a:graphicData uri="http://schemas.openxmlformats.org/drawingml/2006/picture">
+                <pic:pic>
+                  <pic:nvPicPr>
+                    <pic:cNvPr descr="figures/cover_letter_reconstruction.png" id="11" name="Picture"/>
+                    <pic:cNvPicPr>
+                      <a:picLocks noChangeArrowheads="1" noChangeAspect="1"/>
+                    </pic:cNvPicPr>
+                  </pic:nvPicPr>
+                  <pic:blipFill>
+                    <a:blip r:embed="rId9"/>
+                    <a:stretch>
+                      <a:fillRect/>
+                    </a:stretch>
+                  </pic:blipFill>
+                  <pic:spPr bwMode="auto">
+                    <a:xfrm>
+                      <a:off x="0" y="0"/>
+                      <a:ext cx="5334000" cy="1778000"/>
+                    </a:xfrm>
+                    <a:prstGeom prst="rect">
+                      <a:avLst/>
+                    </a:prstGeom>
+                    <a:noFill/>
+                    <a:ln w="9525">
+                      <a:noFill/>
+                      <a:headEnd/>
+                      <a:tailEnd/>
+                    </a:ln>
+                  </pic:spPr>
+                </pic:pic>
+              </a:graphicData>
+            </a:graphic>
+          </wp:inline>
+        </w:drawing>
+      </w:r>
+    </w:p>
+    <w:p>
+      <w:pPr>
+        <w:pStyle w:val="ImageCaption"/>
+        <w:keepLines/>
+        <w:widowControl/>
+        <w:spacing w:before="20" w:after="80" w:line="240" w:lineRule="auto"/>
+        <w:jc w:val="center"/>
+      </w:pPr>
+      <w:r>
+        <w:rPr>
+          <w:rFonts w:ascii="Times New Roman" w:hAnsi="Times New Roman"/>
+          <w:i/>
+          <w:sz w:val="17"/>
+        </w:rPr>
+        <w:t xml:space="preserve">From causal order to operational geometry: declared structure enables</w:t>
+      </w:r>
+      <w:r>
+        <w:rPr>
+          <w:rFonts w:ascii="Times New Roman" w:hAnsi="Times New Roman"/>
+          <w:i/>
+          <w:sz w:val="17"/>
+        </w:rPr>
+        <w:t xml:space="preserve"> </w:t>
+      </w:r>
+      <w:r>
+        <w:rPr>
+          <w:rFonts w:ascii="Times New Roman" w:hAnsi="Times New Roman"/>
+          <w:i/>
+          <w:sz w:val="17"/>
+        </w:rPr>
+        <w:t xml:space="preserve">specific reconstructions (top), tested in a plane wave, a Schwarzschild</w:t>
+      </w:r>
+      <w:r>
+        <w:rPr>
+          <w:rFonts w:ascii="Times New Roman" w:hAnsi="Times New Roman"/>
+          <w:i/>
+          <w:sz w:val="17"/>
+        </w:rPr>
+        <w:t xml:space="preserve"> </w:t>
+      </w:r>
+      <w:r>
+        <w:rPr>
+          <w:rFonts w:ascii="Times New Roman" w:hAnsi="Times New Roman"/>
+          <w:i/>
+          <w:sz w:val="17"/>
+        </w:rPr>
+        <w:t xml:space="preserve">exterior, and a four-rung count/volume ladder</w:t>
+      </w:r>
+      <w:r>
+        <w:rPr>
+          <w:rFonts w:ascii="Times New Roman" w:hAnsi="Times New Roman"/>
+          <w:i/>
+          <w:sz w:val="17"/>
+        </w:rPr>
+        <w:t xml:space="preserve"> </w:t>
+      </w:r>
+      <w:r>
+        <w:rPr>
+          <w:rFonts w:ascii="Times New Roman" w:hAnsi="Times New Roman"/>
+          <w:i/>
+          <w:sz w:val="17"/>
+        </w:rPr>
+        <w:t xml:space="preserve">(bottom).</w:t>
+      </w:r>
+    </w:p>
+    <w:p>
+      <w:pPr>
         <w:pStyle w:val="BodyText"/>
         <w:widowControl/>
       </w:pPr>
       <w:r>
-        <w:t xml:space="preserve">The central contribution is a branched dependency ledger connecting causal</w:t>
-      </w:r>
-      <w:r>
-        <w:t xml:space="preserve"> </w:t>
-      </w:r>
-      <w:r>
-        <w:t xml:space="preserve">order to dimension estimates, proper-time calibration, radar coordinates,</w:t>
-      </w:r>
-      <w:r>
-        <w:t xml:space="preserve"> </w:t>
-      </w:r>
-      <w:r>
-        <w:t xml:space="preserve">oriented Lorentz maps, observer atlases, and measure-dependent volume</w:t>
-      </w:r>
-      <w:r>
-        <w:t xml:space="preserve"> </w:t>
-      </w:r>
-      <w:r>
-        <w:t xml:space="preserve">reconstruction. Each step names its supplied ingredient and reports its</w:t>
-      </w:r>
-      <w:r>
-        <w:t xml:space="preserve"> </w:t>
-      </w:r>
-      <w:r>
-        <w:t xml:space="preserve">finite-density behaviour. Three counterexamples set the boundary of the</w:t>
-      </w:r>
-      <w:r>
-        <w:t xml:space="preserve"> </w:t>
-      </w:r>
-      <w:r>
-        <w:t xml:space="preserve">ledger: order alone supplies no metric scale, a single observer leaves a</w:t>
-      </w:r>
-      <w:r>
-        <w:t xml:space="preserve"> </w:t>
-      </w:r>
-      <w:r>
-        <w:t xml:space="preserve">reflection ambiguity, and finite signal speed alone does not imply Lorentzian</w:t>
-      </w:r>
-      <w:r>
-        <w:t xml:space="preserve"> </w:t>
-      </w:r>
-      <w:r>
-        <w:t xml:space="preserve">geometry. A Rindler analogue gives the expected accessibility boundary.</w:t>
+        <w:t xml:space="preserve">The main contribution is a branched dependency ledger from causal order to</w:t>
+      </w:r>
+      <w:r>
+        <w:t xml:space="preserve"> </w:t>
+      </w:r>
+      <w:r>
+        <w:t xml:space="preserve">dimension estimates, proper-time calibration, radar coordinates, oriented</w:t>
+      </w:r>
+      <w:r>
+        <w:t xml:space="preserve"> </w:t>
+      </w:r>
+      <w:r>
+        <w:t xml:space="preserve">Lorentz maps, observer atlases, and measure-dependent volume reconstruction.</w:t>
+      </w:r>
+      <w:r>
+        <w:t xml:space="preserve"> </w:t>
+      </w:r>
+      <w:r>
+        <w:t xml:space="preserve">Each step declares its input and finite-density behaviour. Counterexamples mark</w:t>
+      </w:r>
+      <w:r>
+        <w:t xml:space="preserve"> </w:t>
+      </w:r>
+      <w:r>
+        <w:t xml:space="preserve">hard boundaries: order alone supplies no metric scale, a single observer leaves</w:t>
+      </w:r>
+      <w:r>
+        <w:t xml:space="preserve"> </w:t>
+      </w:r>
+      <w:r>
+        <w:t xml:space="preserve">a reflection ambiguity, and finite signal speed alone does not imply</w:t>
+      </w:r>
+      <w:r>
+        <w:t xml:space="preserve"> </w:t>
+      </w:r>
+      <w:r>
+        <w:t xml:space="preserve">Lorentzian geometry.</w:t>
       </w:r>
     </w:p>
     <w:p>
@@ -157,67 +261,49 @@
         <w:widowControl/>
       </w:pPr>
       <w:r>
-        <w:t xml:space="preserve">The manuscript also tests the framework in curved spacetime using</w:t>
-      </w:r>
-      <w:r>
-        <w:t xml:space="preserve"> </w:t>
-      </w:r>
-      <w:r>
-        <w:t xml:space="preserve">preregistered numerical stages. In a vacuum plane wave whose coordinate volume form and Poisson</w:t>
-      </w:r>
-      <w:r>
-        <w:t xml:space="preserve"> </w:t>
-      </w:r>
-      <w:r>
-        <w:t xml:space="preserve">sprinkling law are exactly those of the flat comparator, an order-only</w:t>
-      </w:r>
-      <w:r>
-        <w:t xml:space="preserve"> </w:t>
-      </w:r>
-      <w:r>
-        <w:t xml:space="preserve">statistic detects a deliberately strong pure-Weyl deformation at finite</w:t>
-      </w:r>
-      <w:r>
-        <w:t xml:space="preserve"> </w:t>
-      </w:r>
-      <w:r>
-        <w:t xml:space="preserve">density. Separate stages on a frozen Schwarzschild exterior patch confirm the</w:t>
-      </w:r>
-      <w:r>
-        <w:t xml:space="preserve"> </w:t>
-      </w:r>
-      <w:r>
-        <w:t xml:space="preserve">paired causal-relation shift and detect single-poset discrimination with</w:t>
-      </w:r>
-      <w:r>
-        <w:t xml:space="preserve"> </w:t>
-      </w:r>
-      <w:r>
-        <w:t xml:space="preserve">incomplete separation. Finally, a four-rung mass ladder compares sprinkled</w:t>
-      </w:r>
-      <w:r>
-        <w:t xml:space="preserve"> </w:t>
-      </w:r>
-      <w:r>
-        <w:t xml:space="preserve">counts with independently certified continuum four-volumes under a frozen</w:t>
-      </w:r>
-      <w:r>
-        <w:t xml:space="preserve"> </w:t>
-      </w:r>
-      <w:r>
-        <w:t xml:space="preserve">2.5% equivalence rule. These results are presented as controlled validations</w:t>
-      </w:r>
-      <w:r>
-        <w:t xml:space="preserve"> </w:t>
-      </w:r>
-      <w:r>
-        <w:t xml:space="preserve">of reconstruction procedures at specified operating points, not as evidence</w:t>
-      </w:r>
-      <w:r>
-        <w:t xml:space="preserve"> </w:t>
-      </w:r>
-      <w:r>
-        <w:t xml:space="preserve">that spacetime is discrete or reducible to causal order.</w:t>
+        <w:t xml:space="preserve">Preregistered curved-space stages test the ledger at specified operating</w:t>
+      </w:r>
+      <w:r>
+        <w:t xml:space="preserve"> </w:t>
+      </w:r>
+      <w:r>
+        <w:t xml:space="preserve">points. In a vacuum plane wave with the flat comparator’s coordinate volume</w:t>
+      </w:r>
+      <w:r>
+        <w:t xml:space="preserve"> </w:t>
+      </w:r>
+      <w:r>
+        <w:t xml:space="preserve">form and sprinkling law, an order-only statistic detects a deliberately strong</w:t>
+      </w:r>
+      <w:r>
+        <w:t xml:space="preserve"> </w:t>
+      </w:r>
+      <w:r>
+        <w:t xml:space="preserve">pure-Weyl deformation. A frozen Schwarzschild exterior stage confirms paired</w:t>
+      </w:r>
+      <w:r>
+        <w:t xml:space="preserve"> </w:t>
+      </w:r>
+      <w:r>
+        <w:t xml:space="preserve">causal-relation shifts and single-poset discrimination with incomplete</w:t>
+      </w:r>
+      <w:r>
+        <w:t xml:space="preserve"> </w:t>
+      </w:r>
+      <w:r>
+        <w:t xml:space="preserve">separation. A four-rung mass ladder compares sprinkled counts with</w:t>
+      </w:r>
+      <w:r>
+        <w:t xml:space="preserve"> </w:t>
+      </w:r>
+      <w:r>
+        <w:t xml:space="preserve">independently certified continuum four-volumes under a frozen 2.5% equivalence</w:t>
+      </w:r>
+      <w:r>
+        <w:t xml:space="preserve"> </w:t>
+      </w:r>
+      <w:r>
+        <w:t xml:space="preserve">rule.</w:t>
       </w:r>
     </w:p>
     <w:p>
@@ -226,43 +312,37 @@
         <w:widowControl/>
       </w:pPr>
       <w:r>
-        <w:t xml:space="preserve">I believe the manuscript fits CQG because it connects Lorentzian causal</w:t>
-      </w:r>
-      <w:r>
-        <w:t xml:space="preserve"> </w:t>
-      </w:r>
-      <w:r>
-        <w:t xml:space="preserve">structure, discrete-spacetime methods, black-hole exterior numerics, and</w:t>
-      </w:r>
-      <w:r>
-        <w:t xml:space="preserve"> </w:t>
-      </w:r>
-      <w:r>
-        <w:t xml:space="preserve">operational measurement while placing the results in their wider</w:t>
-      </w:r>
-      <w:r>
-        <w:t xml:space="preserve"> </w:t>
-      </w:r>
-      <w:r>
-        <w:t xml:space="preserve">gravitational-physics context. The evidence trail is auditable: decision rules</w:t>
-      </w:r>
-      <w:r>
-        <w:t xml:space="preserve"> </w:t>
-      </w:r>
-      <w:r>
-        <w:t xml:space="preserve">for the curved-space stages were archived before execution, reported figures</w:t>
-      </w:r>
-      <w:r>
-        <w:t xml:space="preserve"> </w:t>
-      </w:r>
-      <w:r>
-        <w:t xml:space="preserve">are regenerated from version-controlled artifacts, and the manuscript states</w:t>
-      </w:r>
-      <w:r>
-        <w:t xml:space="preserve"> </w:t>
-      </w:r>
-      <w:r>
-        <w:t xml:space="preserve">the limitations of every primary verdict.</w:t>
+        <w:t xml:space="preserve">The manuscript fits CQG by connecting Lorentzian causal structure,</w:t>
+      </w:r>
+      <w:r>
+        <w:t xml:space="preserve"> </w:t>
+      </w:r>
+      <w:r>
+        <w:t xml:space="preserve">discrete-spacetime methods, black-hole exterior numerics, and operational</w:t>
+      </w:r>
+      <w:r>
+        <w:t xml:space="preserve"> </w:t>
+      </w:r>
+      <w:r>
+        <w:t xml:space="preserve">measurement. Its claims are deliberately conservative: these are validations</w:t>
+      </w:r>
+      <w:r>
+        <w:t xml:space="preserve"> </w:t>
+      </w:r>
+      <w:r>
+        <w:t xml:space="preserve">of reconstruction procedures, not evidence that spacetime is discrete or</w:t>
+      </w:r>
+      <w:r>
+        <w:t xml:space="preserve"> </w:t>
+      </w:r>
+      <w:r>
+        <w:t xml:space="preserve">reducible to causal order. Decision rules were archived before execution, and</w:t>
+      </w:r>
+      <w:r>
+        <w:t xml:space="preserve"> </w:t>
+      </w:r>
+      <w:r>
+        <w:t xml:space="preserve">reported figures are regenerated from version-controlled artifacts.</w:t>
       </w:r>
     </w:p>
     <w:p>
@@ -329,7 +409,7 @@
       <w:footnotePr>
         <w:numRestart w:val="eachSect"/>
       </w:footnotePr>
-      <w:pgMar w:top="1224" w:bottom="1224" w:left="1440" w:right="1440"/>
+      <w:pgMar w:top="1008" w:bottom="1008" w:left="1296" w:right="1296"/>
     </w:sectPr>
   </w:body>
 </w:document>
@@ -464,7 +544,7 @@
     <w:name w:val="Normal"/>
     <w:qFormat/>
     <w:pPr>
-      <w:spacing w:after="140" w:line="252" w:lineRule="auto"/>
+      <w:spacing w:after="100" w:line="240" w:lineRule="auto"/>
     </w:pPr>
     <w:rPr>
       <w:rFonts w:ascii="Times New Roman" w:hAnsi="Times New Roman"/>

</xml_diff>